<commit_message>
Modernisering datums, alle jaartallen met 15 verhoogd. Naam database gewijzigd in snoep2025.accdb Diverse afbeeldingen opnieuw gemaakt Normalisatie moet nog bijgeschaafd worden
</commit_message>
<xml_diff>
--- a/data/Sneeuwwitje.docx
+++ b/data/Sneeuwwitje.docx
@@ -1,12 +1,18 @@
 
 <file path=word/document.xml><?xml version="1.0" encoding="utf-8"?>
-<w:document xmlns:wpc="http://schemas.microsoft.com/office/word/2010/wordprocessingCanvas" xmlns:cx="http://schemas.microsoft.com/office/drawing/2014/chartex" xmlns:cx1="http://schemas.microsoft.com/office/drawing/2015/9/8/chartex" xmlns:cx2="http://schemas.microsoft.com/office/drawing/2015/10/21/chartex" xmlns:cx3="http://schemas.microsoft.com/office/drawing/2016/5/9/chartex" xmlns:cx4="http://schemas.microsoft.com/office/drawing/2016/5/10/chartex" xmlns:cx5="http://schemas.microsoft.com/office/drawing/2016/5/11/chartex" xmlns:cx6="http://schemas.microsoft.com/office/drawing/2016/5/12/chartex" xmlns:cx7="http://schemas.microsoft.com/office/drawing/2016/5/13/chartex" xmlns:cx8="http://schemas.microsoft.com/office/drawing/2016/5/14/chartex" xmlns:mc="http://schemas.openxmlformats.org/markup-compatibility/2006" xmlns:aink="http://schemas.microsoft.com/office/drawing/2016/ink" xmlns:am3d="http://schemas.microsoft.com/office/drawing/2017/model3d" xmlns:o="urn:schemas-microsoft-com:office:office" xmlns:r="http://schemas.openxmlformats.org/officeDocument/2006/relationships" xmlns:m="http://schemas.openxmlformats.org/officeDocument/2006/math" xmlns:v="urn:schemas-microsoft-com:vml" xmlns:wp14="http://schemas.microsoft.com/office/word/2010/wordprocessingDrawing" xmlns:wp="http://schemas.openxmlformats.org/drawingml/2006/wordprocessingDrawing" xmlns:w10="urn:schemas-microsoft-com:office:word" xmlns:w="http://schemas.openxmlformats.org/wordprocessingml/2006/main" xmlns:w14="http://schemas.microsoft.com/office/word/2010/wordml" xmlns:w15="http://schemas.microsoft.com/office/word/2012/wordml" xmlns:w16cid="http://schemas.microsoft.com/office/word/2016/wordml/cid" xmlns:w16se="http://schemas.microsoft.com/office/word/2015/wordml/symex" xmlns:wpg="http://schemas.microsoft.com/office/word/2010/wordprocessingGroup" xmlns:wpi="http://schemas.microsoft.com/office/word/2010/wordprocessingInk" xmlns:wne="http://schemas.microsoft.com/office/word/2006/wordml" xmlns:wps="http://schemas.microsoft.com/office/word/2010/wordprocessingShape" mc:Ignorable="w14 w15 w16se w16cid wp14">
+<w:document xmlns:wpc="http://schemas.microsoft.com/office/word/2010/wordprocessingCanvas" xmlns:cx="http://schemas.microsoft.com/office/drawing/2014/chartex" xmlns:cx1="http://schemas.microsoft.com/office/drawing/2015/9/8/chartex" xmlns:cx2="http://schemas.microsoft.com/office/drawing/2015/10/21/chartex" xmlns:cx3="http://schemas.microsoft.com/office/drawing/2016/5/9/chartex" xmlns:cx4="http://schemas.microsoft.com/office/drawing/2016/5/10/chartex" xmlns:cx5="http://schemas.microsoft.com/office/drawing/2016/5/11/chartex" xmlns:cx6="http://schemas.microsoft.com/office/drawing/2016/5/12/chartex" xmlns:cx7="http://schemas.microsoft.com/office/drawing/2016/5/13/chartex" xmlns:cx8="http://schemas.microsoft.com/office/drawing/2016/5/14/chartex" xmlns:mc="http://schemas.openxmlformats.org/markup-compatibility/2006" xmlns:aink="http://schemas.microsoft.com/office/drawing/2016/ink" xmlns:am3d="http://schemas.microsoft.com/office/drawing/2017/model3d" xmlns:o="urn:schemas-microsoft-com:office:office" xmlns:oel="http://schemas.microsoft.com/office/2019/extlst" xmlns:r="http://schemas.openxmlformats.org/officeDocument/2006/relationships" xmlns:m="http://schemas.openxmlformats.org/officeDocument/2006/math" xmlns:v="urn:schemas-microsoft-com:vml" xmlns:wp14="http://schemas.microsoft.com/office/word/2010/wordprocessingDrawing" xmlns:wp="http://schemas.openxmlformats.org/drawingml/2006/wordprocessingDrawing" xmlns:w10="urn:schemas-microsoft-com:office:word" xmlns:w="http://schemas.openxmlformats.org/wordprocessingml/2006/main" xmlns:w14="http://schemas.microsoft.com/office/word/2010/wordml" xmlns:w15="http://schemas.microsoft.com/office/word/2012/wordml" xmlns:w16cex="http://schemas.microsoft.com/office/word/2018/wordml/cex" xmlns:w16cid="http://schemas.microsoft.com/office/word/2016/wordml/cid" xmlns:w16="http://schemas.microsoft.com/office/word/2018/wordml" xmlns:w16du="http://schemas.microsoft.com/office/word/2023/wordml/word16du" xmlns:w16sdtdh="http://schemas.microsoft.com/office/word/2020/wordml/sdtdatahash" xmlns:w16sdtfl="http://schemas.microsoft.com/office/word/2024/wordml/sdtformatlock" xmlns:w16se="http://schemas.microsoft.com/office/word/2015/wordml/symex" xmlns:wpg="http://schemas.microsoft.com/office/word/2010/wordprocessingGroup" xmlns:wpi="http://schemas.microsoft.com/office/word/2010/wordprocessingInk" xmlns:wne="http://schemas.microsoft.com/office/word/2006/wordml" xmlns:wps="http://schemas.microsoft.com/office/word/2010/wordprocessingShape" mc:Ignorable="w14 w15 w16se w16cid w16 w16cex w16sdtdh w16sdtfl w16du wp14">
   <w:body>
     <w:p/>
     <w:p/>
     <w:p>
       <w:r>
-        <w:t>20 augustus 2011,</w:t>
+        <w:t>20 augustus 2</w:t>
+      </w:r>
+      <w:r>
+        <w:t>026</w:t>
+      </w:r>
+      <w:r>
+        <w:t>,</w:t>
       </w:r>
     </w:p>
     <w:p/>
@@ -17,23 +23,7 @@
     </w:p>
     <w:p>
       <w:r>
-        <w:t xml:space="preserve">Bij deze willen wij u informeren over een uitbreiding van ons assortiment met een bonbondoos met de naam "Sneeuwwitje". Deze doos bevat voornamelijk bonbons met witte chocolade, gevuld met heerlijke vullingen van </w:t>
-      </w:r>
-      <w:proofErr w:type="spellStart"/>
-      <w:r>
-        <w:t>Amaretto</w:t>
-      </w:r>
-      <w:proofErr w:type="spellEnd"/>
-      <w:r>
-        <w:t xml:space="preserve">, </w:t>
-      </w:r>
-      <w:proofErr w:type="spellStart"/>
-      <w:r>
-        <w:t>Cocos</w:t>
-      </w:r>
-      <w:proofErr w:type="spellEnd"/>
-      <w:r>
-        <w:t xml:space="preserve"> en Pistache. Ter introductie bieden wij u deze doos aan met 20% korting. De code van deze doos is SNEE, het gewicht bedraagt 300 gram en de normale prijs is </w:t>
+        <w:t xml:space="preserve">Bij deze willen wij u informeren over een uitbreiding van ons assortiment met een bonbondoos met de naam "Sneeuwwitje". Deze doos bevat voornamelijk bonbons met witte chocolade, gevuld met heerlijke vullingen van Amaretto, Cocos en Pistache. Ter introductie bieden wij u deze doos aan met 20% korting. De code van deze doos is SNEE, het gewicht bedraagt 300 gram en de normale prijs is </w:t>
       </w:r>
       <w:r>
         <w:t>€</w:t>
@@ -51,8 +41,6 @@
       <w:r>
         <w:t>Vicky Violet</w:t>
       </w:r>
-      <w:bookmarkStart w:id="0" w:name="_GoBack"/>
-      <w:bookmarkEnd w:id="0"/>
     </w:p>
     <w:sectPr>
       <w:pgSz w:w="11906" w:h="16838"/>
@@ -65,7 +53,7 @@
 </file>
 
 <file path=word/styles.xml><?xml version="1.0" encoding="utf-8"?>
-<w:styles xmlns:mc="http://schemas.openxmlformats.org/markup-compatibility/2006" xmlns:r="http://schemas.openxmlformats.org/officeDocument/2006/relationships" xmlns:w="http://schemas.openxmlformats.org/wordprocessingml/2006/main" xmlns:w14="http://schemas.microsoft.com/office/word/2010/wordml" xmlns:w15="http://schemas.microsoft.com/office/word/2012/wordml" xmlns:w16cid="http://schemas.microsoft.com/office/word/2016/wordml/cid" xmlns:w16se="http://schemas.microsoft.com/office/word/2015/wordml/symex" mc:Ignorable="w14 w15 w16se w16cid">
+<w:styles xmlns:mc="http://schemas.openxmlformats.org/markup-compatibility/2006" xmlns:r="http://schemas.openxmlformats.org/officeDocument/2006/relationships" xmlns:w="http://schemas.openxmlformats.org/wordprocessingml/2006/main" xmlns:w14="http://schemas.microsoft.com/office/word/2010/wordml" xmlns:w15="http://schemas.microsoft.com/office/word/2012/wordml" xmlns:w16cex="http://schemas.microsoft.com/office/word/2018/wordml/cex" xmlns:w16cid="http://schemas.microsoft.com/office/word/2016/wordml/cid" xmlns:w16="http://schemas.microsoft.com/office/word/2018/wordml" xmlns:w16du="http://schemas.microsoft.com/office/word/2023/wordml/word16du" xmlns:w16sdtdh="http://schemas.microsoft.com/office/word/2020/wordml/sdtdatahash" xmlns:w16sdtfl="http://schemas.microsoft.com/office/word/2024/wordml/sdtformatlock" xmlns:w16se="http://schemas.microsoft.com/office/word/2015/wordml/symex" mc:Ignorable="w14 w15 w16se w16cid w16 w16cex w16sdtdh w16sdtfl w16du">
   <w:docDefaults>
     <w:rPrDefault>
       <w:rPr>
@@ -81,7 +69,7 @@
       </w:pPr>
     </w:pPrDefault>
   </w:docDefaults>
-  <w:latentStyles w:defLockedState="0" w:defUIPriority="99" w:defSemiHidden="0" w:defUnhideWhenUsed="0" w:defQFormat="0" w:count="375">
+  <w:latentStyles w:defLockedState="0" w:defUIPriority="99" w:defSemiHidden="0" w:defUnhideWhenUsed="0" w:defQFormat="0" w:count="376">
     <w:lsdException w:name="Normal" w:uiPriority="0" w:qFormat="1"/>
     <w:lsdException w:name="heading 1" w:uiPriority="9" w:qFormat="1"/>
     <w:lsdException w:name="heading 2" w:semiHidden="1" w:uiPriority="9" w:unhideWhenUsed="1" w:qFormat="1"/>
@@ -457,6 +445,7 @@
     <w:lsdException w:name="Smart Hyperlink" w:semiHidden="1" w:unhideWhenUsed="1"/>
     <w:lsdException w:name="Hashtag" w:semiHidden="1" w:unhideWhenUsed="1"/>
     <w:lsdException w:name="Unresolved Mention" w:semiHidden="1" w:unhideWhenUsed="1"/>
+    <w:lsdException w:name="Smart Link" w:semiHidden="1" w:unhideWhenUsed="1"/>
   </w:latentStyles>
   <w:style w:type="paragraph" w:default="1" w:styleId="Standaard">
     <w:name w:val="Normal"/>

</xml_diff>